<commit_message>
Contract FR: school phone, end date 2027
Co-Authored-By: Claude Sonnet 5.5 <noreply@anthropic.com>
Claude-Session: https://claude.ai/code/session_01NZxYRpYCJka2jQFTHvmGQ5
</commit_message>
<xml_diff>
--- a/Contrat_Travail_CDD_Assistant_Admin_Informaticien_BCBS_FR.docx
+++ b/Contrat_Travail_CDD_Assistant_Admin_Informaticien_BCBS_FR.docx
@@ -45,7 +45,7 @@
           <w:sz w:val="21"/>
           <w:szCs w:val="21"/>
         </w:rPr>
-        <w:t xml:space="preserve">Dragage, ex-IAI, Yaoundé   |   Tél : ______________________   |   Email : ______________________________</w:t>
+        <w:t xml:space="preserve">Dragage, ex-IAI, Yaoundé   |   Tél : +237 678 34 12 13   |   Email : ______________________________</w:t>
       </w:r>
     </w:p>
     <w:tbl>
@@ -718,7 +718,7 @@
           <w:sz w:val="21"/>
           <w:szCs w:val="21"/>
         </w:rPr>
-        <w:t xml:space="preserve">Il prend effet à la signature du contrat et court du 07 septembre 2026 au 15 juin 2026, date de clôture de l’année scolaire, sans reconduction tacite.</w:t>
+        <w:t xml:space="preserve">Il prend effet à la signature du contrat et court du 07 septembre 2026 au 15 juin 2027, date de clôture de l’année scolaire, sans reconduction tacite.</w:t>
       </w:r>
     </w:p>
     <w:p>

</xml_diff>